<commit_message>
COMMIT 2 DIA 28/11/2025
</commit_message>
<xml_diff>
--- a/2ºDAW/DAW/1ºTrimestre/Unidad 3/Actividades/actividad3.4Pablo.docx
+++ b/2ºDAW/DAW/1ºTrimestre/Unidad 3/Actividades/actividad3.4Pablo.docx
@@ -16,6 +16,15 @@
     <w:p/>
     <w:sdt>
       <w:sdtPr>
+        <w:rPr>
+          <w:rFonts w:asciiTheme="minorHAnsi" w:eastAsiaTheme="minorHAnsi" w:hAnsiTheme="minorHAnsi" w:cstheme="minorBidi"/>
+          <w:color w:val="auto"/>
+          <w:kern w:val="2"/>
+          <w:sz w:val="24"/>
+          <w:szCs w:val="24"/>
+          <w:lang w:eastAsia="en-US"/>
+          <w14:ligatures w14:val="standardContextual"/>
+        </w:rPr>
         <w:id w:val="2094744766"/>
         <w:docPartObj>
           <w:docPartGallery w:val="Table of Contents"/>
@@ -24,15 +33,8 @@
       </w:sdtPr>
       <w:sdtEndPr>
         <w:rPr>
-          <w:rFonts w:asciiTheme="minorHAnsi" w:eastAsiaTheme="minorHAnsi" w:hAnsiTheme="minorHAnsi" w:cstheme="minorBidi"/>
           <w:b/>
           <w:bCs/>
-          <w:color w:val="auto"/>
-          <w:kern w:val="2"/>
-          <w:sz w:val="24"/>
-          <w:szCs w:val="24"/>
-          <w:lang w:eastAsia="en-US"/>
-          <w14:ligatures w14:val="standardContextual"/>
         </w:rPr>
       </w:sdtEndPr>
       <w:sdtContent>
@@ -357,7 +359,6 @@
         <w:t>/ftp</w:t>
       </w:r>
     </w:p>
-    <w:p/>
     <w:p>
       <w:r>
         <w:t>Es obligatorio crear dentro de la carpeta /</w:t>
@@ -376,26 +377,187 @@
       </w:r>
       <w:proofErr w:type="spellEnd"/>
       <w:r>
-        <w:t xml:space="preserve"> para el acceso de</w:t>
-      </w:r>
+        <w:t xml:space="preserve"> para el acceso de usuarios anónimos. Luego cambia los permisos de la carpeta así:</w:t>
+      </w:r>
+    </w:p>
+    <w:p>
+      <w:r>
+        <w:t xml:space="preserve">sudo </w:t>
+      </w:r>
+      <w:proofErr w:type="spellStart"/>
+      <w:r>
+        <w:t>chmod</w:t>
+      </w:r>
+      <w:proofErr w:type="spellEnd"/>
+      <w:r>
+        <w:t xml:space="preserve"> 777 /</w:t>
+      </w:r>
+      <w:proofErr w:type="spellStart"/>
+      <w:r>
+        <w:t>srv</w:t>
+      </w:r>
+      <w:proofErr w:type="spellEnd"/>
+      <w:r>
+        <w:t>/ftp/</w:t>
+      </w:r>
+      <w:proofErr w:type="spellStart"/>
+      <w:r>
+        <w:t>incoming</w:t>
+      </w:r>
+      <w:proofErr w:type="spellEnd"/>
+    </w:p>
+    <w:p>
+      <w:r>
+        <w:t>Por otra parte, para que el servidor ftp incluya por lo menos un archivo en sus carpetas, crearemos un fichero llamado prueba.txt dentro de la carpeta /</w:t>
+      </w:r>
+      <w:proofErr w:type="spellStart"/>
+      <w:r>
+        <w:t>srv</w:t>
+      </w:r>
+      <w:proofErr w:type="spellEnd"/>
+      <w:r>
+        <w:t>/ftp/</w:t>
+      </w:r>
+      <w:proofErr w:type="spellStart"/>
+      <w:r>
+        <w:t>incoming</w:t>
+      </w:r>
+      <w:proofErr w:type="spellEnd"/>
+      <w:r>
+        <w:t xml:space="preserve"> para hacer pruebas de bajada del mismo con el cliente ftp.</w:t>
+      </w:r>
+    </w:p>
+    <w:p>
+      <w:r>
+        <w:t xml:space="preserve">Una manera de crear el fichero es así, desde la línea de comandos, como usuario </w:t>
+      </w:r>
+      <w:proofErr w:type="spellStart"/>
+      <w:r>
+        <w:t>root</w:t>
+      </w:r>
+      <w:proofErr w:type="spellEnd"/>
+      <w:r>
+        <w:t>:</w:t>
+      </w:r>
+    </w:p>
+    <w:p>
+      <w:pPr>
+        <w:ind w:firstLine="708"/>
+      </w:pPr>
+      <w:r>
+        <w:t>echo hola &gt;&gt;/</w:t>
+      </w:r>
+      <w:proofErr w:type="spellStart"/>
+      <w:r>
+        <w:t>srv</w:t>
+      </w:r>
+      <w:proofErr w:type="spellEnd"/>
+      <w:r>
+        <w:t>/ftp/</w:t>
+      </w:r>
+      <w:proofErr w:type="spellStart"/>
+      <w:r>
+        <w:t>incoming</w:t>
+      </w:r>
+      <w:proofErr w:type="spellEnd"/>
+      <w:r>
+        <w:t>/prueba.txt</w:t>
+      </w:r>
+    </w:p>
+    <w:p>
+      <w:r>
+        <w:t xml:space="preserve">Instalar </w:t>
+      </w:r>
+      <w:proofErr w:type="spellStart"/>
+      <w:r>
+        <w:t>vsftpd</w:t>
+      </w:r>
+      <w:proofErr w:type="spellEnd"/>
+      <w:r>
+        <w:t xml:space="preserve"> es muy sencillo:</w:t>
+      </w:r>
+    </w:p>
+    <w:p>
+      <w:r>
+        <w:t>sudo su</w:t>
+      </w:r>
+    </w:p>
+    <w:p>
+      <w:proofErr w:type="spellStart"/>
+      <w:r>
+        <w:t>apt-get</w:t>
+      </w:r>
+      <w:proofErr w:type="spellEnd"/>
       <w:r>
         <w:t xml:space="preserve"> </w:t>
       </w:r>
-      <w:r>
-        <w:t>usuarios anónimos. Luego cambia los permisos de la carpeta así:</w:t>
-      </w:r>
-    </w:p>
-    <w:p>
-      <w:r>
-        <w:t xml:space="preserve">sudo </w:t>
-      </w:r>
-      <w:proofErr w:type="spellStart"/>
-      <w:r>
-        <w:t>chmod</w:t>
-      </w:r>
-      <w:proofErr w:type="spellEnd"/>
-      <w:r>
-        <w:t xml:space="preserve"> 777 /</w:t>
+      <w:proofErr w:type="spellStart"/>
+      <w:r>
+        <w:t>install</w:t>
+      </w:r>
+      <w:proofErr w:type="spellEnd"/>
+      <w:r>
+        <w:t xml:space="preserve"> </w:t>
+      </w:r>
+      <w:proofErr w:type="spellStart"/>
+      <w:r>
+        <w:t>vsftpd</w:t>
+      </w:r>
+      <w:proofErr w:type="spellEnd"/>
+    </w:p>
+    <w:p>
+      <w:r>
+        <w:rPr>
+          <w:noProof/>
+        </w:rPr>
+        <w:drawing>
+          <wp:inline distT="0" distB="0" distL="0" distR="0" wp14:anchorId="2EC3688E" wp14:editId="7D572B64">
+            <wp:extent cx="5400040" cy="159385"/>
+            <wp:effectExtent l="0" t="0" r="0" b="0"/>
+            <wp:docPr id="1" name="Imagen 1"/>
+            <wp:cNvGraphicFramePr>
+              <a:graphicFrameLocks xmlns:a="http://schemas.openxmlformats.org/drawingml/2006/main" noChangeAspect="1"/>
+            </wp:cNvGraphicFramePr>
+            <a:graphic xmlns:a="http://schemas.openxmlformats.org/drawingml/2006/main">
+              <a:graphicData uri="http://schemas.openxmlformats.org/drawingml/2006/picture">
+                <pic:pic xmlns:pic="http://schemas.openxmlformats.org/drawingml/2006/picture">
+                  <pic:nvPicPr>
+                    <pic:cNvPr id="1" name=""/>
+                    <pic:cNvPicPr/>
+                  </pic:nvPicPr>
+                  <pic:blipFill>
+                    <a:blip r:embed="rId8"/>
+                    <a:stretch>
+                      <a:fillRect/>
+                    </a:stretch>
+                  </pic:blipFill>
+                  <pic:spPr>
+                    <a:xfrm>
+                      <a:off x="0" y="0"/>
+                      <a:ext cx="5400040" cy="159385"/>
+                    </a:xfrm>
+                    <a:prstGeom prst="rect">
+                      <a:avLst/>
+                    </a:prstGeom>
+                  </pic:spPr>
+                </pic:pic>
+              </a:graphicData>
+            </a:graphic>
+          </wp:inline>
+        </w:drawing>
+      </w:r>
+    </w:p>
+    <w:p>
+      <w:r>
+        <w:t xml:space="preserve">Al instalarse </w:t>
+      </w:r>
+      <w:proofErr w:type="spellStart"/>
+      <w:r>
+        <w:t>vsftpd</w:t>
+      </w:r>
+      <w:proofErr w:type="spellEnd"/>
+      <w:r>
+        <w:t>, se crean las carpetas /</w:t>
       </w:r>
       <w:proofErr w:type="spellStart"/>
       <w:r>
@@ -403,205 +565,124 @@
       </w:r>
       <w:proofErr w:type="spellEnd"/>
       <w:r>
-        <w:t>/ftp/</w:t>
+        <w:t>/ftp</w:t>
+      </w:r>
+    </w:p>
+    <w:p>
+      <w:r>
+        <w:rPr>
+          <w:noProof/>
+        </w:rPr>
+        <w:drawing>
+          <wp:inline distT="0" distB="0" distL="0" distR="0" wp14:anchorId="1A25C67B" wp14:editId="504F2FFA">
+            <wp:extent cx="5400040" cy="301625"/>
+            <wp:effectExtent l="0" t="0" r="0" b="3175"/>
+            <wp:docPr id="2" name="Imagen 2"/>
+            <wp:cNvGraphicFramePr>
+              <a:graphicFrameLocks xmlns:a="http://schemas.openxmlformats.org/drawingml/2006/main" noChangeAspect="1"/>
+            </wp:cNvGraphicFramePr>
+            <a:graphic xmlns:a="http://schemas.openxmlformats.org/drawingml/2006/main">
+              <a:graphicData uri="http://schemas.openxmlformats.org/drawingml/2006/picture">
+                <pic:pic xmlns:pic="http://schemas.openxmlformats.org/drawingml/2006/picture">
+                  <pic:nvPicPr>
+                    <pic:cNvPr id="1" name=""/>
+                    <pic:cNvPicPr/>
+                  </pic:nvPicPr>
+                  <pic:blipFill>
+                    <a:blip r:embed="rId9"/>
+                    <a:stretch>
+                      <a:fillRect/>
+                    </a:stretch>
+                  </pic:blipFill>
+                  <pic:spPr>
+                    <a:xfrm>
+                      <a:off x="0" y="0"/>
+                      <a:ext cx="5400040" cy="301625"/>
+                    </a:xfrm>
+                    <a:prstGeom prst="rect">
+                      <a:avLst/>
+                    </a:prstGeom>
+                  </pic:spPr>
+                </pic:pic>
+              </a:graphicData>
+            </a:graphic>
+          </wp:inline>
+        </w:drawing>
+      </w:r>
+    </w:p>
+    <w:p>
+      <w:r>
+        <w:t xml:space="preserve">Como se ha dicho anteriormente, si se desea activar usuarios anónimos, es necesario crear una carpeta llamada </w:t>
       </w:r>
       <w:proofErr w:type="spellStart"/>
       <w:r>
         <w:t>incoming</w:t>
       </w:r>
       <w:proofErr w:type="spellEnd"/>
-    </w:p>
-    <w:p/>
-    <w:p>
-      <w:r>
-        <w:t>Por otra parte, para que el servidor ftp incluya por lo menos un archivo en sus carpetas,</w:t>
-      </w:r>
-      <w:r>
+      <w:r>
+        <w:t xml:space="preserve"> como </w:t>
+      </w:r>
+      <w:proofErr w:type="spellStart"/>
+      <w:r>
+        <w:t>superusuario</w:t>
+      </w:r>
+      <w:proofErr w:type="spellEnd"/>
+      <w:r>
+        <w:t xml:space="preserve"> dentro de /</w:t>
+      </w:r>
+      <w:proofErr w:type="spellStart"/>
+      <w:r>
+        <w:t>srv</w:t>
+      </w:r>
+      <w:proofErr w:type="spellEnd"/>
+      <w:r>
+        <w:t>/ftp, de tal forma que esa carpeta tenga como permiso tenga 777, esto es, crear y eliminar archivos tanto para el dueño, grupo y otros.</w:t>
+      </w:r>
+      <w:r>
+        <w:rPr>
+          <w:noProof/>
+        </w:rPr>
         <w:t xml:space="preserve"> </w:t>
       </w:r>
       <w:r>
-        <w:t>crearemos un fichero llamado prueba.txt dentro de la carpeta /</w:t>
-      </w:r>
-      <w:proofErr w:type="spellStart"/>
-      <w:r>
-        <w:t>srv</w:t>
-      </w:r>
-      <w:proofErr w:type="spellEnd"/>
-      <w:r>
-        <w:t>/ftp/</w:t>
-      </w:r>
-      <w:proofErr w:type="spellStart"/>
-      <w:r>
-        <w:t>incoming</w:t>
-      </w:r>
-      <w:proofErr w:type="spellEnd"/>
-      <w:r>
-        <w:t xml:space="preserve"> para hacer pruebas</w:t>
-      </w:r>
-      <w:r>
-        <w:t xml:space="preserve"> </w:t>
-      </w:r>
-      <w:r>
-        <w:t>de bajada del mismo con el cliente ftp.</w:t>
-      </w:r>
-    </w:p>
-    <w:p>
-      <w:r>
-        <w:t xml:space="preserve">Una manera de crear el fichero es así, desde la línea de comandos, como usuario </w:t>
-      </w:r>
-      <w:proofErr w:type="spellStart"/>
-      <w:r>
-        <w:t>root</w:t>
-      </w:r>
-      <w:proofErr w:type="spellEnd"/>
-      <w:r>
-        <w:t>:</w:t>
-      </w:r>
-    </w:p>
-    <w:p>
-      <w:pPr>
-        <w:ind w:firstLine="708"/>
-      </w:pPr>
-      <w:r>
-        <w:t>echo hola &gt;&gt;/</w:t>
-      </w:r>
-      <w:proofErr w:type="spellStart"/>
-      <w:r>
-        <w:t>srv</w:t>
-      </w:r>
-      <w:proofErr w:type="spellEnd"/>
-      <w:r>
-        <w:t>/ftp/</w:t>
-      </w:r>
-      <w:proofErr w:type="spellStart"/>
-      <w:r>
-        <w:t>incoming</w:t>
-      </w:r>
-      <w:proofErr w:type="spellEnd"/>
-      <w:r>
-        <w:t>/prueba.txt</w:t>
-      </w:r>
-    </w:p>
-    <w:p>
-      <w:r>
-        <w:t xml:space="preserve">Instalar </w:t>
-      </w:r>
-      <w:proofErr w:type="spellStart"/>
-      <w:r>
-        <w:t>vsftpd</w:t>
-      </w:r>
-      <w:proofErr w:type="spellEnd"/>
-      <w:r>
-        <w:t xml:space="preserve"> es muy sencillo:</w:t>
-      </w:r>
-    </w:p>
-    <w:p>
-      <w:r>
-        <w:t>sudo su</w:t>
-      </w:r>
-    </w:p>
-    <w:p>
-      <w:proofErr w:type="spellStart"/>
-      <w:r>
-        <w:t>apt-get</w:t>
-      </w:r>
-      <w:proofErr w:type="spellEnd"/>
-      <w:r>
-        <w:t xml:space="preserve"> </w:t>
-      </w:r>
-      <w:proofErr w:type="spellStart"/>
-      <w:r>
-        <w:t>install</w:t>
-      </w:r>
-      <w:proofErr w:type="spellEnd"/>
-      <w:r>
-        <w:t xml:space="preserve"> </w:t>
-      </w:r>
-      <w:proofErr w:type="spellStart"/>
-      <w:r>
-        <w:t>vsftpd</w:t>
-      </w:r>
-      <w:proofErr w:type="spellEnd"/>
-    </w:p>
-    <w:p/>
-    <w:p>
-      <w:r>
-        <w:t xml:space="preserve">Al instalarse </w:t>
-      </w:r>
-      <w:proofErr w:type="spellStart"/>
-      <w:r>
-        <w:t>vsftpd</w:t>
-      </w:r>
-      <w:proofErr w:type="spellEnd"/>
-      <w:r>
-        <w:t>, se crean las carpetas /</w:t>
-      </w:r>
-      <w:proofErr w:type="spellStart"/>
-      <w:r>
-        <w:t>srv</w:t>
-      </w:r>
-      <w:proofErr w:type="spellEnd"/>
-      <w:r>
-        <w:t>/ftp</w:t>
-      </w:r>
-    </w:p>
-    <w:p>
-      <w:r>
-        <w:t>Como se ha dicho anteriormente, si se desea activar usuarios anónimos, es necesario crear una</w:t>
-      </w:r>
-      <w:r>
-        <w:t xml:space="preserve"> </w:t>
-      </w:r>
-      <w:r>
-        <w:t xml:space="preserve">carpeta llamada </w:t>
-      </w:r>
-      <w:proofErr w:type="spellStart"/>
-      <w:r>
-        <w:t>incoming</w:t>
-      </w:r>
-      <w:proofErr w:type="spellEnd"/>
-      <w:r>
-        <w:t xml:space="preserve"> como </w:t>
-      </w:r>
-      <w:proofErr w:type="spellStart"/>
-      <w:r>
-        <w:t>superusuario</w:t>
-      </w:r>
-      <w:proofErr w:type="spellEnd"/>
-      <w:r>
-        <w:t xml:space="preserve"> dentro de /</w:t>
-      </w:r>
-      <w:proofErr w:type="spellStart"/>
-      <w:r>
-        <w:t>srv</w:t>
-      </w:r>
-      <w:proofErr w:type="spellEnd"/>
-      <w:r>
-        <w:t>/ftp, de tal forma que esa carpeta</w:t>
-      </w:r>
-      <w:r>
-        <w:t xml:space="preserve"> </w:t>
-      </w:r>
-      <w:r>
-        <w:t>tenga como permiso</w:t>
-      </w:r>
-      <w:r>
-        <w:t xml:space="preserve"> </w:t>
-      </w:r>
-      <w:r>
-        <w:t>tenga 777, esto es, crear y eliminar archivos tanto para el dueño, grupo y</w:t>
-      </w:r>
-      <w:r>
-        <w:t xml:space="preserve"> </w:t>
-      </w:r>
-      <w:r>
-        <w:t>otros.</w:t>
-      </w:r>
-    </w:p>
-    <w:p/>
-    <w:p>
-      <w:r>
-        <w:br w:type="page"/>
+        <w:rPr>
+          <w:noProof/>
+        </w:rPr>
+        <w:drawing>
+          <wp:inline distT="0" distB="0" distL="0" distR="0" wp14:anchorId="683E332F" wp14:editId="7FA62A45">
+            <wp:extent cx="5400040" cy="186690"/>
+            <wp:effectExtent l="0" t="0" r="0" b="3810"/>
+            <wp:docPr id="3" name="Imagen 3"/>
+            <wp:cNvGraphicFramePr>
+              <a:graphicFrameLocks xmlns:a="http://schemas.openxmlformats.org/drawingml/2006/main" noChangeAspect="1"/>
+            </wp:cNvGraphicFramePr>
+            <a:graphic xmlns:a="http://schemas.openxmlformats.org/drawingml/2006/main">
+              <a:graphicData uri="http://schemas.openxmlformats.org/drawingml/2006/picture">
+                <pic:pic xmlns:pic="http://schemas.openxmlformats.org/drawingml/2006/picture">
+                  <pic:nvPicPr>
+                    <pic:cNvPr id="1" name=""/>
+                    <pic:cNvPicPr/>
+                  </pic:nvPicPr>
+                  <pic:blipFill>
+                    <a:blip r:embed="rId10"/>
+                    <a:stretch>
+                      <a:fillRect/>
+                    </a:stretch>
+                  </pic:blipFill>
+                  <pic:spPr>
+                    <a:xfrm>
+                      <a:off x="0" y="0"/>
+                      <a:ext cx="5400040" cy="186690"/>
+                    </a:xfrm>
+                    <a:prstGeom prst="rect">
+                      <a:avLst/>
+                    </a:prstGeom>
+                  </pic:spPr>
+                </pic:pic>
+              </a:graphicData>
+            </a:graphic>
+          </wp:inline>
+        </w:drawing>
       </w:r>
     </w:p>
     <w:p>
@@ -673,6 +754,46 @@
       <w:pPr>
         <w:pStyle w:val="Prrafodelista"/>
       </w:pPr>
+      <w:r>
+        <w:rPr>
+          <w:noProof/>
+        </w:rPr>
+        <w:drawing>
+          <wp:inline distT="0" distB="0" distL="0" distR="0" wp14:anchorId="663B5E5D" wp14:editId="7932F41E">
+            <wp:extent cx="5400040" cy="2245995"/>
+            <wp:effectExtent l="0" t="0" r="0" b="1905"/>
+            <wp:docPr id="4" name="Imagen 4"/>
+            <wp:cNvGraphicFramePr>
+              <a:graphicFrameLocks xmlns:a="http://schemas.openxmlformats.org/drawingml/2006/main" noChangeAspect="1"/>
+            </wp:cNvGraphicFramePr>
+            <a:graphic xmlns:a="http://schemas.openxmlformats.org/drawingml/2006/main">
+              <a:graphicData uri="http://schemas.openxmlformats.org/drawingml/2006/picture">
+                <pic:pic xmlns:pic="http://schemas.openxmlformats.org/drawingml/2006/picture">
+                  <pic:nvPicPr>
+                    <pic:cNvPr id="1" name=""/>
+                    <pic:cNvPicPr/>
+                  </pic:nvPicPr>
+                  <pic:blipFill>
+                    <a:blip r:embed="rId11"/>
+                    <a:stretch>
+                      <a:fillRect/>
+                    </a:stretch>
+                  </pic:blipFill>
+                  <pic:spPr>
+                    <a:xfrm>
+                      <a:off x="0" y="0"/>
+                      <a:ext cx="5400040" cy="2245995"/>
+                    </a:xfrm>
+                    <a:prstGeom prst="rect">
+                      <a:avLst/>
+                    </a:prstGeom>
+                  </pic:spPr>
+                </pic:pic>
+              </a:graphicData>
+            </a:graphic>
+          </wp:inline>
+        </w:drawing>
+      </w:r>
     </w:p>
     <w:p>
       <w:pPr>
@@ -708,6 +829,46 @@
       <w:pPr>
         <w:pStyle w:val="Prrafodelista"/>
       </w:pPr>
+      <w:r>
+        <w:rPr>
+          <w:noProof/>
+        </w:rPr>
+        <w:drawing>
+          <wp:inline distT="0" distB="0" distL="0" distR="0" wp14:anchorId="7F2767FA" wp14:editId="355E8571">
+            <wp:extent cx="5400040" cy="117475"/>
+            <wp:effectExtent l="0" t="0" r="0" b="0"/>
+            <wp:docPr id="5" name="Imagen 5"/>
+            <wp:cNvGraphicFramePr>
+              <a:graphicFrameLocks xmlns:a="http://schemas.openxmlformats.org/drawingml/2006/main" noChangeAspect="1"/>
+            </wp:cNvGraphicFramePr>
+            <a:graphic xmlns:a="http://schemas.openxmlformats.org/drawingml/2006/main">
+              <a:graphicData uri="http://schemas.openxmlformats.org/drawingml/2006/picture">
+                <pic:pic xmlns:pic="http://schemas.openxmlformats.org/drawingml/2006/picture">
+                  <pic:nvPicPr>
+                    <pic:cNvPr id="1" name=""/>
+                    <pic:cNvPicPr/>
+                  </pic:nvPicPr>
+                  <pic:blipFill>
+                    <a:blip r:embed="rId12"/>
+                    <a:stretch>
+                      <a:fillRect/>
+                    </a:stretch>
+                  </pic:blipFill>
+                  <pic:spPr>
+                    <a:xfrm>
+                      <a:off x="0" y="0"/>
+                      <a:ext cx="5400040" cy="117475"/>
+                    </a:xfrm>
+                    <a:prstGeom prst="rect">
+                      <a:avLst/>
+                    </a:prstGeom>
+                  </pic:spPr>
+                </pic:pic>
+              </a:graphicData>
+            </a:graphic>
+          </wp:inline>
+        </w:drawing>
+      </w:r>
     </w:p>
     <w:p>
       <w:pPr>
@@ -738,6 +899,46 @@
       <w:pPr>
         <w:pStyle w:val="Prrafodelista"/>
       </w:pPr>
+      <w:r>
+        <w:rPr>
+          <w:noProof/>
+        </w:rPr>
+        <w:drawing>
+          <wp:inline distT="0" distB="0" distL="0" distR="0" wp14:anchorId="4080EA50" wp14:editId="29DE782F">
+            <wp:extent cx="5400040" cy="1766570"/>
+            <wp:effectExtent l="0" t="0" r="0" b="5080"/>
+            <wp:docPr id="7" name="Imagen 7"/>
+            <wp:cNvGraphicFramePr>
+              <a:graphicFrameLocks xmlns:a="http://schemas.openxmlformats.org/drawingml/2006/main" noChangeAspect="1"/>
+            </wp:cNvGraphicFramePr>
+            <a:graphic xmlns:a="http://schemas.openxmlformats.org/drawingml/2006/main">
+              <a:graphicData uri="http://schemas.openxmlformats.org/drawingml/2006/picture">
+                <pic:pic xmlns:pic="http://schemas.openxmlformats.org/drawingml/2006/picture">
+                  <pic:nvPicPr>
+                    <pic:cNvPr id="1" name=""/>
+                    <pic:cNvPicPr/>
+                  </pic:nvPicPr>
+                  <pic:blipFill>
+                    <a:blip r:embed="rId13"/>
+                    <a:stretch>
+                      <a:fillRect/>
+                    </a:stretch>
+                  </pic:blipFill>
+                  <pic:spPr>
+                    <a:xfrm>
+                      <a:off x="0" y="0"/>
+                      <a:ext cx="5400040" cy="1766570"/>
+                    </a:xfrm>
+                    <a:prstGeom prst="rect">
+                      <a:avLst/>
+                    </a:prstGeom>
+                  </pic:spPr>
+                </pic:pic>
+              </a:graphicData>
+            </a:graphic>
+          </wp:inline>
+        </w:drawing>
+      </w:r>
     </w:p>
     <w:p>
       <w:pPr>
@@ -748,13 +949,7 @@
         </w:numPr>
       </w:pPr>
       <w:r>
-        <w:t>usar un cliente ftp para comprobar que el servidor está configurado correctamente con los</w:t>
-      </w:r>
-      <w:r>
-        <w:t xml:space="preserve"> </w:t>
-      </w:r>
-      <w:r>
-        <w:t>parámetros que hemos puesto.</w:t>
+        <w:t>usar un cliente ftp para comprobar que el servidor está configurado correctamente con los parámetros que hemos puesto.</w:t>
       </w:r>
     </w:p>
     <w:p>
@@ -783,19 +978,7 @@
       </w:r>
       <w:proofErr w:type="spellEnd"/>
       <w:r>
-        <w:t>, con o sin contraseña, y da igual la</w:t>
-      </w:r>
-      <w:r>
-        <w:t xml:space="preserve"> </w:t>
-      </w:r>
-      <w:r>
-        <w:t>contraseña si se pone. No tiene permisos ni de subida ni de escritura en el servidor FTP. Sólo se</w:t>
-      </w:r>
-      <w:r>
-        <w:t xml:space="preserve"> </w:t>
-      </w:r>
-      <w:r>
-        <w:t>le permite descargar.</w:t>
+        <w:t>, con o sin contraseña, y da igual la contraseña si se pone. No tiene permisos ni de subida ni de escritura en el servidor FTP. Sólo se le permite descargar.</w:t>
       </w:r>
     </w:p>
     <w:p>
@@ -833,8 +1016,6 @@
       </w:r>
       <w:r>
         <w:tab/>
-      </w:r>
-      <w:r>
         <w:t xml:space="preserve">se permite el acceso al usuario </w:t>
       </w:r>
       <w:proofErr w:type="spellStart"/>
@@ -860,14 +1041,13 @@
       </w:r>
       <w:r>
         <w:tab/>
-      </w:r>
-      <w:r>
         <w:t>se permite el archivo de log</w:t>
       </w:r>
     </w:p>
     <w:p>
       <w:proofErr w:type="spellStart"/>
       <w:r>
+        <w:lastRenderedPageBreak/>
         <w:t>xferlog_file</w:t>
       </w:r>
       <w:proofErr w:type="spellEnd"/>
@@ -884,8 +1064,6 @@
       </w:r>
       <w:r>
         <w:tab/>
-      </w:r>
-      <w:r>
         <w:t>nombre del archivo de log</w:t>
       </w:r>
     </w:p>
@@ -906,17 +1084,12 @@
       </w:r>
       <w:r>
         <w:tab/>
-      </w:r>
-      <w:r>
         <w:t>no se permiten usuarios locales</w:t>
       </w:r>
     </w:p>
     <w:p>
       <w:r>
-        <w:t>Si se quisieran permitir usuarios locales también, basta con poner a YES la directiva</w:t>
-      </w:r>
-      <w:r>
-        <w:t xml:space="preserve"> </w:t>
+        <w:t xml:space="preserve">Si se quisieran permitir usuarios locales también, basta con poner a YES la directiva </w:t>
       </w:r>
       <w:proofErr w:type="spellStart"/>
       <w:r>
@@ -932,24 +1105,12 @@
         <w:pStyle w:val="Ttulo2"/>
       </w:pPr>
       <w:r>
-        <w:t>CASO 2: Usuario anónimo, sin usuarios locales, con permiso de subida y</w:t>
-      </w:r>
-      <w:r>
-        <w:t xml:space="preserve"> </w:t>
-      </w:r>
-      <w:r>
-        <w:t>de creación de carpetas:</w:t>
-      </w:r>
-    </w:p>
-    <w:p>
-      <w:r>
-        <w:t>Atención, de esta forma la seguridad queda comprometida. Habría que asignar, por lo pronto, una</w:t>
-      </w:r>
-      <w:r>
-        <w:t xml:space="preserve"> </w:t>
-      </w:r>
-      <w:r>
-        <w:t>cuota de disco para este usuario, con el objeto de que no se desborde el disco duro del servidor.</w:t>
+        <w:t>CASO 2: Usuario anónimo, sin usuarios locales, con permiso de subida y de creación de carpetas:</w:t>
+      </w:r>
+    </w:p>
+    <w:p>
+      <w:r>
+        <w:t>Atención, de esta forma la seguridad queda comprometida. Habría que asignar, por lo pronto, una cuota de disco para este usuario, con el objeto de que no se desborde el disco duro del servidor.</w:t>
       </w:r>
     </w:p>
     <w:p>
@@ -984,8 +1145,6 @@
       </w:r>
       <w:r>
         <w:tab/>
-      </w:r>
-      <w:r>
         <w:t xml:space="preserve">se permite el acceso al usuario </w:t>
       </w:r>
       <w:proofErr w:type="spellStart"/>
@@ -1008,15 +1167,12 @@
       </w:r>
       <w:r>
         <w:tab/>
-      </w:r>
-      <w:r>
         <w:t>se permite la escritura en el servidor</w:t>
       </w:r>
     </w:p>
     <w:p>
       <w:proofErr w:type="spellStart"/>
       <w:r>
-        <w:lastRenderedPageBreak/>
         <w:t>anon_upload_enable</w:t>
       </w:r>
       <w:proofErr w:type="spellEnd"/>
@@ -1028,8 +1184,6 @@
       </w:r>
       <w:r>
         <w:tab/>
-      </w:r>
-      <w:r>
         <w:t xml:space="preserve">se permite subir archivos al usuario </w:t>
       </w:r>
       <w:proofErr w:type="spellStart"/>
@@ -1049,8 +1203,6 @@
       </w:r>
       <w:r>
         <w:tab/>
-      </w:r>
-      <w:r>
         <w:t xml:space="preserve">se permite crear carpetas al usuario </w:t>
       </w:r>
       <w:proofErr w:type="spellStart"/>
@@ -1102,8 +1254,6 @@
       </w:r>
       <w:r>
         <w:tab/>
-      </w:r>
-      <w:r>
         <w:t>se permite el archivo de log</w:t>
       </w:r>
     </w:p>
@@ -1126,8 +1276,6 @@
       </w:r>
       <w:r>
         <w:tab/>
-      </w:r>
-      <w:r>
         <w:t>nombre del archivo de log</w:t>
       </w:r>
     </w:p>
@@ -1148,20 +1296,12 @@
       </w:r>
       <w:r>
         <w:tab/>
-      </w:r>
-      <w:r>
         <w:t>no se permiten usuarios locales</w:t>
       </w:r>
     </w:p>
     <w:p>
       <w:r>
-        <w:t>Con esta configuración, se permite la subida de archivos y carpetas, pero no su borrado o su</w:t>
-      </w:r>
-      <w:r>
-        <w:t xml:space="preserve"> </w:t>
-      </w:r>
-      <w:r>
-        <w:t>renombrado. Para ello hace falta poner (no recomendada por seguridad):</w:t>
+        <w:t>Con esta configuración, se permite la subida de archivos y carpetas, pero no su borrado o su renombrado. Para ello hace falta poner (no recomendada por seguridad):</w:t>
       </w:r>
     </w:p>
     <w:p>
@@ -1218,8 +1358,6 @@
       </w:r>
       <w:r>
         <w:tab/>
-      </w:r>
-      <w:r>
         <w:t xml:space="preserve">no se permite el acceso al usuario </w:t>
       </w:r>
       <w:proofErr w:type="spellStart"/>
@@ -1245,8 +1383,6 @@
       </w:r>
       <w:r>
         <w:tab/>
-      </w:r>
-      <w:r>
         <w:t>se permiten usuarios locales</w:t>
       </w:r>
     </w:p>
@@ -1267,8 +1403,6 @@
       </w:r>
       <w:r>
         <w:tab/>
-      </w:r>
-      <w:r>
         <w:t>se permite la escritura en el servidor</w:t>
       </w:r>
     </w:p>
@@ -1315,14 +1449,13 @@
       </w:r>
       <w:r>
         <w:tab/>
-      </w:r>
-      <w:r>
         <w:t>se permite el archivo de log</w:t>
       </w:r>
     </w:p>
     <w:p>
       <w:proofErr w:type="spellStart"/>
       <w:r>
+        <w:lastRenderedPageBreak/>
         <w:t>xferlog_file</w:t>
       </w:r>
       <w:proofErr w:type="spellEnd"/>
@@ -1339,78 +1472,58 @@
       </w:r>
       <w:r>
         <w:tab/>
-      </w:r>
-      <w:r>
         <w:t>nombre del archivo de log</w:t>
       </w:r>
     </w:p>
     <w:p>
       <w:r>
-        <w:t>Con esta configuración, se permite la subida de archivos y directorios, y la creación, borrado y</w:t>
-      </w:r>
-      <w:r>
-        <w:t xml:space="preserve"> </w:t>
-      </w:r>
-      <w:r>
-        <w:t>modificación de directorios.</w:t>
-      </w:r>
-    </w:p>
-    <w:p>
-      <w:r>
-        <w:t>Al no estar el usuario local enjaulado, podrá moverse libremente (desde su carpeta personal) por</w:t>
-      </w:r>
-      <w:r>
-        <w:t xml:space="preserve"> </w:t>
-      </w:r>
-      <w:r>
-        <w:t>el árbol de directorios del servidor FTP. Por ejemplo, prueba a crear una carpeta dentro de</w:t>
-      </w:r>
-      <w:r>
-        <w:t xml:space="preserve"> </w:t>
-      </w:r>
+        <w:t>Con esta configuración, se permite la subida de archivos y directorios, y la creación, borrado y modificación de directorios.</w:t>
+      </w:r>
+    </w:p>
+    <w:p>
+      <w:r>
+        <w:t>Al no estar el usuario local enjaulado, podrá moverse libremente (desde su carpeta personal) por el árbol de directorios del servidor FTP. Por ejemplo, prueba a crear una carpeta dentro de /</w:t>
+      </w:r>
+      <w:proofErr w:type="spellStart"/>
+      <w:r>
+        <w:t>srv</w:t>
+      </w:r>
+      <w:proofErr w:type="spellEnd"/>
+      <w:r>
+        <w:t>/ftp/</w:t>
+      </w:r>
+      <w:proofErr w:type="spellStart"/>
+      <w:r>
+        <w:t>incoming</w:t>
+      </w:r>
+      <w:proofErr w:type="spellEnd"/>
+      <w:r>
+        <w:t xml:space="preserve"> siendo usuario local</w:t>
+      </w:r>
+    </w:p>
+    <w:p/>
+    <w:p>
+      <w:pPr>
+        <w:pStyle w:val="Ttulo2"/>
+      </w:pPr>
+      <w:r>
+        <w:t>CASO 4: Usuarios locales, anónimos no, enjaulados:</w:t>
+      </w:r>
+    </w:p>
+    <w:p>
+      <w:r>
+        <w:t>En /</w:t>
+      </w:r>
+      <w:proofErr w:type="spellStart"/>
+      <w:r>
+        <w:t>etc</w:t>
+      </w:r>
+      <w:proofErr w:type="spellEnd"/>
       <w:r>
         <w:t>/</w:t>
       </w:r>
       <w:proofErr w:type="spellStart"/>
       <w:r>
-        <w:t>srv</w:t>
-      </w:r>
-      <w:proofErr w:type="spellEnd"/>
-      <w:r>
-        <w:t>/ftp/</w:t>
-      </w:r>
-      <w:proofErr w:type="spellStart"/>
-      <w:r>
-        <w:t>incoming</w:t>
-      </w:r>
-      <w:proofErr w:type="spellEnd"/>
-      <w:r>
-        <w:t xml:space="preserve"> siendo usuario local</w:t>
-      </w:r>
-    </w:p>
-    <w:p/>
-    <w:p>
-      <w:pPr>
-        <w:pStyle w:val="Ttulo2"/>
-      </w:pPr>
-      <w:r>
-        <w:t>CASO 4: Usuarios locales, anónimos no, enjaulados:</w:t>
-      </w:r>
-    </w:p>
-    <w:p>
-      <w:r>
-        <w:t>En /</w:t>
-      </w:r>
-      <w:proofErr w:type="spellStart"/>
-      <w:r>
-        <w:t>etc</w:t>
-      </w:r>
-      <w:proofErr w:type="spellEnd"/>
-      <w:r>
-        <w:t>/</w:t>
-      </w:r>
-      <w:proofErr w:type="spellStart"/>
-      <w:r>
         <w:t>vsftpd.conf</w:t>
       </w:r>
       <w:proofErr w:type="spellEnd"/>
@@ -1432,8 +1545,6 @@
       </w:r>
       <w:r>
         <w:tab/>
-      </w:r>
-      <w:r>
         <w:t xml:space="preserve">no se permite el acceso al usuario </w:t>
       </w:r>
       <w:proofErr w:type="spellStart"/>
@@ -1459,8 +1570,6 @@
       </w:r>
       <w:r>
         <w:tab/>
-      </w:r>
-      <w:r>
         <w:t>se permiten usuarios locales</w:t>
       </w:r>
     </w:p>
@@ -1478,8 +1587,6 @@
       </w:r>
       <w:r>
         <w:tab/>
-      </w:r>
-      <w:r>
         <w:t>los usuarios locales estarán enjaulados</w:t>
       </w:r>
     </w:p>
@@ -1500,15 +1607,12 @@
       </w:r>
       <w:r>
         <w:tab/>
-      </w:r>
-      <w:r>
         <w:t>se permite la escritura en el servidor</w:t>
       </w:r>
     </w:p>
     <w:p>
       <w:proofErr w:type="spellStart"/>
       <w:r>
-        <w:lastRenderedPageBreak/>
         <w:t>local_umask</w:t>
       </w:r>
       <w:proofErr w:type="spellEnd"/>
@@ -1549,8 +1653,6 @@
       </w:r>
       <w:r>
         <w:tab/>
-      </w:r>
-      <w:r>
         <w:t>se permite el archivo de log</w:t>
       </w:r>
     </w:p>
@@ -1573,8 +1675,6 @@
       </w:r>
       <w:r>
         <w:tab/>
-      </w:r>
-      <w:r>
         <w:t>nombre del archivo de log</w:t>
       </w:r>
     </w:p>
@@ -1675,17 +1775,11 @@
     <w:p/>
     <w:p>
       <w:r>
-        <w:t>Con esta configuración, los usuarios locales no podrán ir más arriba en el árbol de directorios de</w:t>
-      </w:r>
-      <w:r>
-        <w:t xml:space="preserve"> </w:t>
-      </w:r>
-      <w:r>
-        <w:t>su carpeta personal.</w:t>
+        <w:t>Con esta configuración, los usuarios locales no podrán ir más arriba en el árbol de directorios de su carpeta personal.</w:t>
       </w:r>
     </w:p>
     <w:sectPr>
-      <w:footerReference w:type="default" r:id="rId8"/>
+      <w:footerReference w:type="default" r:id="rId14"/>
       <w:pgSz w:w="11906" w:h="16838"/>
       <w:pgMar w:top="1417" w:right="1701" w:bottom="1417" w:left="1701" w:header="708" w:footer="708" w:gutter="0"/>
       <w:cols w:space="708"/>

</xml_diff>